<commit_message>
Fw: Unit 2.3 Moodle Notes Fixes #60
</commit_message>
<xml_diff>
--- a/docs/LDRS-591.docx
+++ b/docs/LDRS-591.docx
@@ -23,7 +23,7 @@
         <w:pStyle w:val="Date"/>
       </w:pPr>
       <w:r>
-        <w:t xml:space="preserve">Jan 22, 2026</w:t>
+        <w:t xml:space="preserve">Jan 29, 2026</w:t>
       </w:r>
     </w:p>
     <w:p>
@@ -6079,71 +6079,6 @@
         <w:pStyle w:val="BodyText"/>
       </w:pPr>
       <w:r>
-        <w:t xml:space="preserve">Mixed methods research reflects the biblical principle of seeking wisdom through multiple sources (</w:t>
-      </w:r>
-      <w:r>
-        <w:t xml:space="preserve">“Plans fail for lack of counsel, but with many advisers, they succeed,”</w:t>
-      </w:r>
-      <w:r>
-        <w:t xml:space="preserve"> </w:t>
-      </w:r>
-      <w:r>
-        <w:rPr>
-          <w:i/>
-          <w:iCs/>
-        </w:rPr>
-        <w:t xml:space="preserve">The</w:t>
-      </w:r>
-      <w:r>
-        <w:rPr>
-          <w:i/>
-          <w:iCs/>
-        </w:rPr>
-        <w:t xml:space="preserve"> </w:t>
-      </w:r>
-      <w:r>
-        <w:rPr>
-          <w:i/>
-          <w:iCs/>
-        </w:rPr>
-        <w:t xml:space="preserve">Holy Bible</w:t>
-      </w:r>
-      <w:r>
-        <w:rPr>
-          <w:i/>
-          <w:iCs/>
-        </w:rPr>
-        <w:t xml:space="preserve">,</w:t>
-      </w:r>
-      <w:r>
-        <w:rPr>
-          <w:i/>
-          <w:iCs/>
-        </w:rPr>
-        <w:t xml:space="preserve"> </w:t>
-      </w:r>
-      <w:r>
-        <w:rPr>
-          <w:i/>
-          <w:iCs/>
-        </w:rPr>
-        <w:t xml:space="preserve">New International Version</w:t>
-      </w:r>
-      <w:r>
-        <w:t xml:space="preserve"> </w:t>
-      </w:r>
-      <w:r>
-        <w:t xml:space="preserve">(2011)</w:t>
-      </w:r>
-      <w:r>
-        <w:t xml:space="preserve">, Proverbs 15:22). Combining quantitative and qualitative insights mirrors the Christian commitment to balance and thorough understanding in addressing complex issues.</w:t>
-      </w:r>
-    </w:p>
-    <w:p>
-      <w:pPr>
-        <w:pStyle w:val="BodyText"/>
-      </w:pPr>
-      <w:r>
         <w:t xml:space="preserve">Rosch et al.</w:t>
       </w:r>
       <w:r>
@@ -26158,11 +26093,7 @@
     </w:p>
     <w:bookmarkEnd w:id="142"/>
     <w:bookmarkEnd w:id="143"/>
-    <w:sectPr>
-      <w:footnotePr>
-        <w:numRestart w:val="eachSect"/>
-      </w:footnotePr>
-    </w:sectPr>
+    <w:sectPr/>
   </w:body>
 </w:document>
 </file>
@@ -28515,6 +28446,8 @@
     </w:pPr>
     <w:rPr>
       <w:rFonts w:asciiTheme="majorHAnsi" w:cstheme="majorBidi" w:eastAsiaTheme="majorEastAsia" w:hAnsiTheme="majorHAnsi"/>
+      <w:spacing w:val="-10"/>
+      <w:kern w:val="28"/>
       <w:sz w:val="56"/>
       <w:szCs w:val="56"/>
     </w:rPr>
@@ -28527,6 +28460,8 @@
     <w:rsid w:val="00A10FD9"/>
     <w:rPr>
       <w:rFonts w:asciiTheme="majorHAnsi" w:cstheme="majorBidi" w:eastAsiaTheme="majorEastAsia" w:hAnsiTheme="majorHAnsi"/>
+      <w:spacing w:val="-10"/>
+      <w:kern w:val="28"/>
       <w:sz w:val="56"/>
       <w:szCs w:val="56"/>
     </w:rPr>
@@ -28567,31 +28502,23 @@
   </w:style>
   <w:style w:customStyle="1" w:styleId="Author" w:type="paragraph">
     <w:name w:val="Author"/>
-    <w:basedOn w:val="Title"/>
     <w:next w:val="BodyText"/>
     <w:qFormat/>
     <w:pPr>
       <w:keepNext/>
       <w:keepLines/>
+      <w:jc w:val="center"/>
     </w:pPr>
-    <w:rPr>
-      <w:sz w:val="24"/>
-      <w:szCs w:val="24"/>
-    </w:rPr>
   </w:style>
   <w:style w:styleId="Date" w:type="paragraph">
     <w:name w:val="Date"/>
-    <w:basedOn w:val="Title"/>
     <w:next w:val="BodyText"/>
     <w:qFormat/>
     <w:pPr>
       <w:keepNext/>
       <w:keepLines/>
+      <w:jc w:val="center"/>
     </w:pPr>
-    <w:rPr>
-      <w:sz w:val="24"/>
-      <w:szCs w:val="24"/>
-    </w:rPr>
   </w:style>
   <w:style w:customStyle="1" w:styleId="AbstractTitle" w:type="paragraph">
     <w:name w:val="Abstract Title"/>

</xml_diff>